<commit_message>
Update framework: Enterprise-only wording and Fabric analytics context layer
Co-Authored-By: Claude Opus 5.5 <noreply@anthropic.com>
Claude-Session: https://claude.ai/code/session_01NaLz5BuBCKvrta1coSusAm
</commit_message>
<xml_diff>
--- a/AI_Tooling_Licensing_Framework.docx
+++ b/AI_Tooling_Licensing_Framework.docx
@@ -131,7 +131,7 @@
     <w:p>
       <w:pPr/>
       <w:r>
-        <w:t xml:space="preserve">Only two options are truly flat: Copilot inside Microsoft 365 apps, and Claude Team seats. Claude Enterprise is not one of them. Its $20 seat buys access, and all usage is billed on top at API rates.</w:t>
+        <w:t xml:space="preserve">Only Copilot inside Microsoft 365 apps is truly flat. Claude Enterprise, which we use, is not. Its $20 seat buys access, and all usage is billed on top at API rates.</w:t>
       </w:r>
     </w:p>
     <w:tbl>
@@ -367,63 +367,6 @@
             <w:pPr/>
             <w:r>
               <w:t xml:space="preserve">Customer-facing or high-volume agents</w:t>
-            </w:r>
-          </w:p>
-        </w:tc>
-      </w:tr>
-      <w:tr>
-        <w:tc>
-          <w:tcPr>
-            <w:tcW w:w="2340" w:type="dxa"/>
-          </w:tcPr>
-          <w:p>
-            <w:pPr/>
-            <w:hyperlink r:id="rId5" w:history="1">
-              <w:r>
-                <w:rPr>
-                  <w:rStyle w:val="Hyperlink"/>
-                </w:rPr>
-                <w:t xml:space="preserve">Claude Team</w:t>
-              </w:r>
-            </w:hyperlink>
-          </w:p>
-        </w:tc>
-        <w:tc>
-          <w:tcPr>
-            <w:tcW w:w="2340" w:type="dxa"/>
-          </w:tcPr>
-          <w:p>
-            <w:pPr/>
-            <w:r>
-              <w:t xml:space="preserve">Standard $20, Premium $100 per seat/month (annual); 150 seats max</w:t>
-            </w:r>
-          </w:p>
-        </w:tc>
-        <w:tc>
-          <w:tcPr>
-            <w:tcW w:w="2340" w:type="dxa"/>
-          </w:tcPr>
-          <w:p>
-            <w:pPr/>
-            <w:r>
-              <w:rPr>
-                <w:b/>
-              </w:rPr>
-              <w:t xml:space="preserve">Flat</w:t>
-            </w:r>
-            <w:r>
-              <w:t xml:space="preserve">, with 5-hour and weekly limits</w:t>
-            </w:r>
-          </w:p>
-        </w:tc>
-        <w:tc>
-          <w:tcPr>
-            <w:tcW w:w="2340" w:type="dxa"/>
-          </w:tcPr>
-          <w:p>
-            <w:pPr/>
-            <w:r>
-              <w:t xml:space="preserve">Predictable power users, if SCIM and audit logs aren't required</w:t>
             </w:r>
           </w:p>
         </w:tc>
@@ -1043,10 +986,10 @@
         <w:rPr>
           <w:b/>
         </w:rPr>
-        <w:t xml:space="preserve">Team vs. Enterprise.</w:t>
-      </w:r>
-      <w:r>
-        <w:t xml:space="preserve"> Claude Team gives flat-priced seats with usage included, but it has no SCIM or audit logs and tops out at 150 seats. For a governed company rollout, Enterprise with caps is the right choice. Team only fits a small, contained pilot, if Security accepts the missing controls.</w:t>
+        <w:t xml:space="preserve">Why caps matter for us.</w:t>
+      </w:r>
+      <w:r>
+        <w:t xml:space="preserve"> We're on Claude Enterprise, where every message is billed at API rates and there's no flat-priced tier to fall back on. Spend caps and good working habits are the only cost controls. The analytics section below applies this to our heaviest use today.</w:t>
       </w:r>
     </w:p>
     <w:p>
@@ -1398,6 +1341,540 @@
       </w:hyperlink>
       <w:r>
         <w:t xml:space="preserve"> is billed through Microsoft at standard API rates. Calling Anthropic directly gets new features first. Going through Foundry keeps billing and access control in Azure. Ask the Microsoft account team whether Foundry spend counts toward our Azure commitment; if it does, Foundry is the better default.</w:t>
+      </w:r>
+    </w:p>
+    <w:p>
+      <w:pPr>
+        <w:pStyle w:val="Heading2"/>
+      </w:pPr>
+      <w:r>
+        <w:t xml:space="preserve">Analytics on Claude Enterprise: Fabric as the context layer</w:t>
+      </w:r>
+    </w:p>
+    <w:p>
+      <w:pPr/>
+      <w:r>
+        <w:t xml:space="preserve">Yes, this is the right pattern. Keep the data and the business definitions in Fabric, and have Claude query them through a connector instead of people uploading exports. Analytics is where Enterprise usage grows fastest, because every uploaded file and every rebuilt chart is billed at API rates.</w:t>
+      </w:r>
+    </w:p>
+    <w:p>
+      <w:pPr/>
+      <w:r>
+        <w:drawing>
+          <wp:inline distT="0" distB="0" distL="0" distR="0">
+            <wp:extent cx="5486400" cy="2506435"/>
+            <wp:docPr id="2" name="image2" descr="analytics data flow · today vs. target"/>
+            <a:graphic xmlns:a="http://schemas.openxmlformats.org/drawingml/2006/main">
+              <a:graphicData uri="http://schemas.openxmlformats.org/drawingml/2006/picture">
+                <pic:pic xmlns:pic="http://schemas.openxmlformats.org/drawingml/2006/picture">
+                  <pic:nvPicPr>
+                    <pic:cNvPr id="2" name="image2" descr="analytics data flow · today vs. target"/>
+                    <pic:cNvPicPr/>
+                  </pic:nvPicPr>
+                  <pic:blipFill>
+                    <a:blip r:embed="rId10"/>
+                    <a:stretch>
+                      <a:fillRect/>
+                    </a:stretch>
+                  </pic:blipFill>
+                  <pic:spPr>
+                    <a:xfrm>
+                      <a:off x="0" y="0"/>
+                      <a:ext cx="5486400" cy="2506435"/>
+                    </a:xfrm>
+                    <a:prstGeom prst="rect">
+                      <a:avLst/>
+                    </a:prstGeom>
+                  </pic:spPr>
+                </pic:pic>
+              </a:graphicData>
+            </a:graphic>
+          </wp:inline>
+        </w:drawing>
+      </w:r>
+    </w:p>
+    <w:p>
+      <w:pPr/>
+      <w:r>
+        <w:t xml:space="preserve">analytics data flow · today vs. target</w:t>
+      </w:r>
+    </w:p>
+    <w:p>
+      <w:pPr/>
+      <w:r>
+        <w:rPr>
+          <w:b/>
+        </w:rPr>
+        <w:t xml:space="preserve">Where analytics usage goes today:</w:t>
+      </w:r>
+    </w:p>
+    <w:p>
+      <w:pPr>
+        <w:pStyle w:val="ListParagraph"/>
+        <w:numPr>
+          <w:ilvl w:val="0"/>
+          <w:numId w:val="8"/>
+        </w:numPr>
+      </w:pPr>
+      <w:r>
+        <w:t xml:space="preserve">Exports are uploaded into chats. The whole file becomes conversation context and is read again on later turns.</w:t>
+      </w:r>
+    </w:p>
+    <w:p>
+      <w:pPr>
+        <w:pStyle w:val="ListParagraph"/>
+        <w:numPr>
+          <w:ilvl w:val="0"/>
+          <w:numId w:val="8"/>
+        </w:numPr>
+      </w:pPr>
+      <w:r>
+        <w:t xml:space="preserve">Each person rebuilds the same report as a new artifact, paying for output tokens every time.</w:t>
+      </w:r>
+    </w:p>
+    <w:p>
+      <w:pPr>
+        <w:pStyle w:val="ListParagraph"/>
+        <w:numPr>
+          <w:ilvl w:val="0"/>
+          <w:numId w:val="8"/>
+        </w:numPr>
+      </w:pPr>
+      <w:r>
+        <w:t xml:space="preserve">Every chat re-explains what "net sales" or "fiscal week" means, and the answers can disagree.</w:t>
+      </w:r>
+    </w:p>
+    <w:p>
+      <w:pPr/>
+      <w:r>
+        <w:rPr>
+          <w:b/>
+        </w:rPr>
+        <w:t xml:space="preserve">The target pattern has five parts:</w:t>
+      </w:r>
+    </w:p>
+    <w:tbl>
+      <w:tblPr>
+        <w:tblStyle w:val="TableGrid"/>
+        <w:tblW w:w="0" w:type="auto"/>
+        <w:tblLayout w:type="fixed"/>
+        <w:tblLook w:val="04A0" w:firstRow="1" w:lastRow="0" w:firstColumn="0" w:lastColumn="0" w:noHBand="0" w:noVBand="1"/>
+      </w:tblPr>
+      <w:tblGrid>
+        <w:gridCol w:w="3120"/>
+        <w:gridCol w:w="3120"/>
+        <w:gridCol w:w="3120"/>
+      </w:tblGrid>
+      <w:tr>
+        <w:trPr>
+          <w:tblHeader/>
+        </w:trPr>
+        <w:tc>
+          <w:tcPr>
+            <w:tcW w:w="3120" w:type="dxa"/>
+            <w:shd w:val="clear" w:color="auto" w:fill="F2F2F2"/>
+          </w:tcPr>
+          <w:p>
+            <w:pPr/>
+            <w:r>
+              <w:t xml:space="preserve">Part</w:t>
+            </w:r>
+          </w:p>
+        </w:tc>
+        <w:tc>
+          <w:tcPr>
+            <w:tcW w:w="3120" w:type="dxa"/>
+            <w:shd w:val="clear" w:color="auto" w:fill="F2F2F2"/>
+          </w:tcPr>
+          <w:p>
+            <w:pPr/>
+            <w:r>
+              <w:t xml:space="preserve">What it is</w:t>
+            </w:r>
+          </w:p>
+        </w:tc>
+        <w:tc>
+          <w:tcPr>
+            <w:tcW w:w="3120" w:type="dxa"/>
+            <w:shd w:val="clear" w:color="auto" w:fill="F2F2F2"/>
+          </w:tcPr>
+          <w:p>
+            <w:pPr/>
+            <w:r>
+              <w:t xml:space="preserve">Owner</w:t>
+            </w:r>
+          </w:p>
+        </w:tc>
+      </w:tr>
+      <w:tr>
+        <w:tc>
+          <w:tcPr>
+            <w:tcW w:w="3120" w:type="dxa"/>
+          </w:tcPr>
+          <w:p>
+            <w:pPr/>
+            <w:r>
+              <w:t xml:space="preserve">Gold layer in Fabric</w:t>
+            </w:r>
+          </w:p>
+        </w:tc>
+        <w:tc>
+          <w:tcPr>
+            <w:tcW w:w="3120" w:type="dxa"/>
+          </w:tcPr>
+          <w:p>
+            <w:pPr/>
+            <w:r>
+              <w:t xml:space="preserve">Curated, aggregated tables. Joins and heavy calculations run here, on capacity we already pay for</w:t>
+            </w:r>
+          </w:p>
+        </w:tc>
+        <w:tc>
+          <w:tcPr>
+            <w:tcW w:w="3120" w:type="dxa"/>
+          </w:tcPr>
+          <w:p>
+            <w:pPr/>
+            <w:r>
+              <w:t xml:space="preserve">Data engineering</w:t>
+            </w:r>
+          </w:p>
+        </w:tc>
+      </w:tr>
+      <w:tr>
+        <w:tc>
+          <w:tcPr>
+            <w:tcW w:w="3120" w:type="dxa"/>
+          </w:tcPr>
+          <w:p>
+            <w:pPr/>
+            <w:r>
+              <w:t xml:space="preserve">Certified semantic models</w:t>
+            </w:r>
+          </w:p>
+        </w:tc>
+        <w:tc>
+          <w:tcPr>
+            <w:tcW w:w="3120" w:type="dxa"/>
+          </w:tcPr>
+          <w:p>
+            <w:pPr/>
+            <w:r>
+              <w:t xml:space="preserve">Measures, clear names and descriptions, and row-level security. This is the context layer Claude reads</w:t>
+            </w:r>
+          </w:p>
+        </w:tc>
+        <w:tc>
+          <w:tcPr>
+            <w:tcW w:w="3120" w:type="dxa"/>
+          </w:tcPr>
+          <w:p>
+            <w:pPr/>
+            <w:r>
+              <w:t xml:space="preserve">BI team</w:t>
+            </w:r>
+          </w:p>
+        </w:tc>
+      </w:tr>
+      <w:tr>
+        <w:tc>
+          <w:tcPr>
+            <w:tcW w:w="3120" w:type="dxa"/>
+          </w:tcPr>
+          <w:p>
+            <w:pPr/>
+            <w:hyperlink r:id="rId11" w:history="1">
+              <w:r>
+                <w:rPr>
+                  <w:rStyle w:val="Hyperlink"/>
+                </w:rPr>
+                <w:t xml:space="preserve">Fabric IQ MCP</w:t>
+              </w:r>
+            </w:hyperlink>
+            <w:r>
+              <w:t xml:space="preserve"> connector</w:t>
+            </w:r>
+          </w:p>
+        </w:tc>
+        <w:tc>
+          <w:tcPr>
+            <w:tcW w:w="3120" w:type="dxa"/>
+          </w:tcPr>
+          <w:p>
+            <w:pPr/>
+            <w:r>
+              <w:t xml:space="preserve">Microsoft's read-only MCP server for Power BI models, generally available. Every query runs as the signed-in user, so RLS and OLS still apply</w:t>
+            </w:r>
+          </w:p>
+        </w:tc>
+        <w:tc>
+          <w:tcPr>
+            <w:tcW w:w="3120" w:type="dxa"/>
+          </w:tcPr>
+          <w:p>
+            <w:pPr/>
+            <w:r>
+              <w:t xml:space="preserve">Claude Owner adds it once; each user signs in</w:t>
+            </w:r>
+          </w:p>
+        </w:tc>
+      </w:tr>
+      <w:tr>
+        <w:tc>
+          <w:tcPr>
+            <w:tcW w:w="3120" w:type="dxa"/>
+          </w:tcPr>
+          <w:p>
+            <w:pPr/>
+            <w:r>
+              <w:t xml:space="preserve">Org skill and Projects</w:t>
+            </w:r>
+          </w:p>
+        </w:tc>
+        <w:tc>
+          <w:tcPr>
+            <w:tcW w:w="3120" w:type="dxa"/>
+          </w:tcPr>
+          <w:p>
+            <w:pPr/>
+            <w:r>
+              <w:t xml:space="preserve">Microsoft's </w:t>
+            </w:r>
+            <w:hyperlink r:id="rId12" w:history="1">
+              <w:r>
+                <w:rPr>
+                  <w:rStyle w:val="Hyperlink"/>
+                </w:rPr>
+                <w:t xml:space="preserve">Fabric IQ skill</w:t>
+              </w:r>
+            </w:hyperlink>
+            <w:r>
+              <w:t xml:space="preserve">, plus our own skill with KPI definitions and the fiscal calendar, </w:t>
+            </w:r>
+            <w:hyperlink r:id="rId13" w:history="1">
+              <w:r>
+                <w:rPr>
+                  <w:rStyle w:val="Hyperlink"/>
+                </w:rPr>
+                <w:t xml:space="preserve">provisioned org-wide</w:t>
+              </w:r>
+            </w:hyperlink>
+            <w:r>
+              <w:t xml:space="preserve">. One Project per domain: Sales, Supply Chain, Finance</w:t>
+            </w:r>
+          </w:p>
+        </w:tc>
+        <w:tc>
+          <w:tcPr>
+            <w:tcW w:w="3120" w:type="dxa"/>
+          </w:tcPr>
+          <w:p>
+            <w:pPr/>
+            <w:r>
+              <w:t xml:space="preserve">Central AI Team</w:t>
+            </w:r>
+          </w:p>
+        </w:tc>
+      </w:tr>
+      <w:tr>
+        <w:tc>
+          <w:tcPr>
+            <w:tcW w:w="3120" w:type="dxa"/>
+          </w:tcPr>
+          <w:p>
+            <w:pPr/>
+            <w:r>
+              <w:t xml:space="preserve">Shared artifacts</w:t>
+            </w:r>
+          </w:p>
+        </w:tc>
+        <w:tc>
+          <w:tcPr>
+            <w:tcW w:w="3120" w:type="dxa"/>
+          </w:tcPr>
+          <w:p>
+            <w:pPr/>
+            <w:r>
+              <w:t xml:space="preserve">One live dashboard artifact per recurring report, built once and shared</w:t>
+            </w:r>
+          </w:p>
+        </w:tc>
+        <w:tc>
+          <w:tcPr>
+            <w:tcW w:w="3120" w:type="dxa"/>
+          </w:tcPr>
+          <w:p>
+            <w:pPr/>
+            <w:r>
+              <w:t xml:space="preserve">Report owner</w:t>
+            </w:r>
+          </w:p>
+        </w:tc>
+      </w:tr>
+    </w:tbl>
+    <w:p>
+      <w:pPr/>
+      <w:r>
+        <w:rPr>
+          <w:b/>
+        </w:rPr>
+        <w:t xml:space="preserve">Why it costs less.</w:t>
+      </w:r>
+      <w:r>
+        <w:t xml:space="preserve"> Claude gets back small, aggregated results instead of whole files; Fabric IQ returns up to 250 rows by default. Definitions come from the model and the skill, so nobody retypes them. One shared artifact replaces many rebuilt ones. Viewers of a shared artifact use their own connector sign-in, and any Claude use inside it counts against the viewer's own plan (</w:t>
+      </w:r>
+      <w:hyperlink r:id="rId14" w:history="1">
+        <w:r>
+          <w:rPr>
+            <w:rStyle w:val="Hyperlink"/>
+          </w:rPr>
+          <w:t xml:space="preserve">Anthropic</w:t>
+        </w:r>
+      </w:hyperlink>
+      <w:r>
+        <w:t xml:space="preserve">).</w:t>
+      </w:r>
+    </w:p>
+    <w:p>
+      <w:pPr/>
+      <w:r>
+        <w:rPr>
+          <w:b/>
+        </w:rPr>
+        <w:t xml:space="preserve">Rules for analysts:</w:t>
+      </w:r>
+    </w:p>
+    <w:p>
+      <w:pPr>
+        <w:pStyle w:val="ListParagraph"/>
+        <w:numPr>
+          <w:ilvl w:val="0"/>
+          <w:numId w:val="9"/>
+        </w:numPr>
+      </w:pPr>
+      <w:r>
+        <w:t xml:space="preserve">Recurring analysis goes through the connector, never uploaded exports. Small one-off files are fine.</w:t>
+      </w:r>
+    </w:p>
+    <w:p>
+      <w:pPr>
+        <w:pStyle w:val="ListParagraph"/>
+        <w:numPr>
+          <w:ilvl w:val="0"/>
+          <w:numId w:val="9"/>
+        </w:numPr>
+      </w:pPr>
+      <w:r>
+        <w:t xml:space="preserve">Check the shared artifact gallery before building a chart. Ask the owner to extend an existing artifact rather than rebuilding it.</w:t>
+      </w:r>
+    </w:p>
+    <w:p>
+      <w:pPr>
+        <w:pStyle w:val="ListParagraph"/>
+        <w:numPr>
+          <w:ilvl w:val="0"/>
+          <w:numId w:val="9"/>
+        </w:numPr>
+      </w:pPr>
+      <w:r>
+        <w:t xml:space="preserve">Use Sonnet 5.5 for analytics by default, and Opus 5.5 for hard modeling questions.</w:t>
+      </w:r>
+    </w:p>
+    <w:p>
+      <w:pPr>
+        <w:pStyle w:val="ListParagraph"/>
+        <w:numPr>
+          <w:ilvl w:val="0"/>
+          <w:numId w:val="9"/>
+        </w:numPr>
+      </w:pPr>
+      <w:r>
+        <w:t xml:space="preserve">If the data you need isn't in a certified model, request it through the intake portal instead of exporting it.</w:t>
+      </w:r>
+    </w:p>
+    <w:p>
+      <w:pPr/>
+      <w:r>
+        <w:rPr>
+          <w:b/>
+        </w:rPr>
+        <w:t xml:space="preserve">Check before rollout:</w:t>
+      </w:r>
+    </w:p>
+    <w:p>
+      <w:pPr>
+        <w:pStyle w:val="ListParagraph"/>
+        <w:numPr>
+          <w:ilvl w:val="0"/>
+          <w:numId w:val="10"/>
+        </w:numPr>
+      </w:pPr>
+      <w:r>
+        <w:rPr>
+          <w:b/>
+        </w:rPr>
+        <w:t xml:space="preserve">Security sign-off.</w:t>
+      </w:r>
+      <w:r>
+        <w:t xml:space="preserve"> Microsoft notes that query results sent through MCP go to the client and its model provider, outside Fabric's compliance boundary (</w:t>
+      </w:r>
+      <w:hyperlink r:id="rId15" w:history="1">
+        <w:r>
+          <w:rPr>
+            <w:rStyle w:val="Hyperlink"/>
+          </w:rPr>
+          <w:t xml:space="preserve">Microsoft</w:t>
+        </w:r>
+      </w:hyperlink>
+      <w:r>
+        <w:t xml:space="preserve">). Security needs to approve this flow, just as for Claude inside Copilot.</w:t>
+      </w:r>
+    </w:p>
+    <w:p>
+      <w:pPr>
+        <w:pStyle w:val="ListParagraph"/>
+        <w:numPr>
+          <w:ilvl w:val="0"/>
+          <w:numId w:val="10"/>
+        </w:numPr>
+      </w:pPr>
+      <w:r>
+        <w:rPr>
+          <w:b/>
+        </w:rPr>
+        <w:t xml:space="preserve">Fabric Data Agents.</w:t>
+      </w:r>
+      <w:r>
+        <w:t xml:space="preserve"> They can also be published as MCP servers, but they don't support dynamic client registration (</w:t>
+      </w:r>
+      <w:hyperlink r:id="rId16" w:history="1">
+        <w:r>
+          <w:rPr>
+            <w:rStyle w:val="Hyperlink"/>
+          </w:rPr>
+          <w:t xml:space="preserve">Microsoft</w:t>
+        </w:r>
+      </w:hyperlink>
+      <w:r>
+        <w:t xml:space="preserve">). Test whether one connects as a Claude custom connector before relying on it. Fabric IQ is the supported path for Power BI models.</w:t>
+      </w:r>
+    </w:p>
+    <w:p>
+      <w:pPr>
+        <w:pStyle w:val="ListParagraph"/>
+        <w:numPr>
+          <w:ilvl w:val="0"/>
+          <w:numId w:val="10"/>
+        </w:numPr>
+      </w:pPr>
+      <w:r>
+        <w:rPr>
+          <w:b/>
+        </w:rPr>
+        <w:t xml:space="preserve">Refresh schedules.</w:t>
+      </w:r>
+      <w:r>
+        <w:t xml:space="preserve"> Each Fabric IQ query targets one semantic model and returns data as of its last refresh, so the models need refresh schedules that match how analysts use them.</w:t>
       </w:r>
     </w:p>
     <w:p>
@@ -1802,7 +2279,7 @@
         <w:pStyle w:val="ListParagraph"/>
         <w:numPr>
           <w:ilvl w:val="0"/>
-          <w:numId w:val="8"/>
+          <w:numId w:val="11"/>
         </w:numPr>
       </w:pPr>
       <w:r>
@@ -1833,7 +2310,7 @@
         <w:pStyle w:val="ListParagraph"/>
         <w:numPr>
           <w:ilvl w:val="0"/>
-          <w:numId w:val="8"/>
+          <w:numId w:val="11"/>
         </w:numPr>
       </w:pPr>
       <w:r>
@@ -1862,7 +2339,7 @@
         <w:pStyle w:val="ListParagraph"/>
         <w:numPr>
           <w:ilvl w:val="0"/>
-          <w:numId w:val="8"/>
+          <w:numId w:val="11"/>
         </w:numPr>
       </w:pPr>
       <w:r>
@@ -1880,7 +2357,7 @@
         <w:pStyle w:val="ListParagraph"/>
         <w:numPr>
           <w:ilvl w:val="0"/>
-          <w:numId w:val="8"/>
+          <w:numId w:val="11"/>
         </w:numPr>
       </w:pPr>
       <w:r>
@@ -1921,7 +2398,7 @@
         <w:pStyle w:val="ListParagraph"/>
         <w:numPr>
           <w:ilvl w:val="0"/>
-          <w:numId w:val="9"/>
+          <w:numId w:val="12"/>
         </w:numPr>
       </w:pPr>
       <w:r>
@@ -1933,7 +2410,7 @@
         <w:pStyle w:val="ListParagraph"/>
         <w:numPr>
           <w:ilvl w:val="0"/>
-          <w:numId w:val="9"/>
+          <w:numId w:val="12"/>
         </w:numPr>
       </w:pPr>
       <w:r>
@@ -1945,7 +2422,7 @@
         <w:pStyle w:val="ListParagraph"/>
         <w:numPr>
           <w:ilvl w:val="0"/>
-          <w:numId w:val="9"/>
+          <w:numId w:val="12"/>
         </w:numPr>
       </w:pPr>
       <w:r>
@@ -1957,7 +2434,7 @@
         <w:pStyle w:val="ListParagraph"/>
         <w:numPr>
           <w:ilvl w:val="0"/>
-          <w:numId w:val="9"/>
+          <w:numId w:val="12"/>
         </w:numPr>
       </w:pPr>
       <w:r>
@@ -1969,7 +2446,7 @@
         <w:pStyle w:val="ListParagraph"/>
         <w:numPr>
           <w:ilvl w:val="0"/>
-          <w:numId w:val="9"/>
+          <w:numId w:val="12"/>
         </w:numPr>
       </w:pPr>
       <w:r>
@@ -1981,7 +2458,7 @@
         <w:pStyle w:val="ListParagraph"/>
         <w:numPr>
           <w:ilvl w:val="0"/>
-          <w:numId w:val="9"/>
+          <w:numId w:val="12"/>
         </w:numPr>
       </w:pPr>
       <w:r>
@@ -2291,16 +2768,16 @@
         <w:drawing>
           <wp:inline distT="0" distB="0" distL="0" distR="0">
             <wp:extent cx="5486400" cy="2792185"/>
-            <wp:docPr id="2" name="image2" descr="rollout · 3 phases, 2 gates, 13 weeks"/>
+            <wp:docPr id="3" name="image3" descr="rollout · 3 phases, 2 gates, 13 weeks"/>
             <a:graphic xmlns:a="http://schemas.openxmlformats.org/drawingml/2006/main">
               <a:graphicData uri="http://schemas.openxmlformats.org/drawingml/2006/picture">
                 <pic:pic xmlns:pic="http://schemas.openxmlformats.org/drawingml/2006/picture">
                   <pic:nvPicPr>
-                    <pic:cNvPr id="2" name="image2" descr="rollout · 3 phases, 2 gates, 13 weeks"/>
+                    <pic:cNvPr id="3" name="image3" descr="rollout · 3 phases, 2 gates, 13 weeks"/>
                     <pic:cNvPicPr/>
                   </pic:nvPicPr>
                   <pic:blipFill>
-                    <a:blip r:embed="rId10"/>
+                    <a:blip r:embed="rId17"/>
                     <a:stretch>
                       <a:fillRect/>
                     </a:stretch>
@@ -2346,7 +2823,7 @@
         <w:pStyle w:val="ListParagraph"/>
         <w:numPr>
           <w:ilvl w:val="0"/>
-          <w:numId w:val="10"/>
+          <w:numId w:val="13"/>
         </w:numPr>
       </w:pPr>
       <w:r>
@@ -2367,7 +2844,7 @@
         <w:pStyle w:val="ListParagraph"/>
         <w:numPr>
           <w:ilvl w:val="0"/>
-          <w:numId w:val="10"/>
+          <w:numId w:val="13"/>
         </w:numPr>
       </w:pPr>
       <w:r>
@@ -2388,7 +2865,7 @@
         <w:pStyle w:val="ListParagraph"/>
         <w:numPr>
           <w:ilvl w:val="0"/>
-          <w:numId w:val="10"/>
+          <w:numId w:val="13"/>
         </w:numPr>
       </w:pPr>
       <w:r>
@@ -2409,7 +2886,7 @@
         <w:pStyle w:val="ListParagraph"/>
         <w:numPr>
           <w:ilvl w:val="0"/>
-          <w:numId w:val="10"/>
+          <w:numId w:val="13"/>
         </w:numPr>
       </w:pPr>
       <w:r>
@@ -2430,7 +2907,7 @@
         <w:pStyle w:val="ListParagraph"/>
         <w:numPr>
           <w:ilvl w:val="0"/>
-          <w:numId w:val="10"/>
+          <w:numId w:val="13"/>
         </w:numPr>
       </w:pPr>
       <w:r>
@@ -2448,6 +2925,69 @@
     </w:p>
     <w:p>
       <w:pPr>
+        <w:pStyle w:val="ListParagraph"/>
+        <w:numPr>
+          <w:ilvl w:val="0"/>
+          <w:numId w:val="14"/>
+        </w:numPr>
+      </w:pPr>
+      <w:r>
+        <w:t xml:space="preserve">☐ </w:t>
+      </w:r>
+      <w:r>
+        <w:rPr>
+          <w:b/>
+        </w:rPr>
+        <w:t xml:space="preserve">BI team:</w:t>
+      </w:r>
+      <w:r>
+        <w:t xml:space="preserve"> name the first two semantic models to certify for Claude, with measure descriptions and RLS checked.</w:t>
+      </w:r>
+    </w:p>
+    <w:p>
+      <w:pPr>
+        <w:pStyle w:val="ListParagraph"/>
+        <w:numPr>
+          <w:ilvl w:val="0"/>
+          <w:numId w:val="14"/>
+        </w:numPr>
+      </w:pPr>
+      <w:r>
+        <w:t xml:space="preserve">☐ </w:t>
+      </w:r>
+      <w:r>
+        <w:rPr>
+          <w:b/>
+        </w:rPr>
+        <w:t xml:space="preserve">Security:</w:t>
+      </w:r>
+      <w:r>
+        <w:t xml:space="preserve"> approve the Fabric IQ MCP data flow into Claude, then a Claude Owner adds the connector.</w:t>
+      </w:r>
+    </w:p>
+    <w:p>
+      <w:pPr>
+        <w:pStyle w:val="ListParagraph"/>
+        <w:numPr>
+          <w:ilvl w:val="0"/>
+          <w:numId w:val="14"/>
+        </w:numPr>
+      </w:pPr>
+      <w:r>
+        <w:t xml:space="preserve">☐ </w:t>
+      </w:r>
+      <w:r>
+        <w:rPr>
+          <w:b/>
+        </w:rPr>
+        <w:t xml:space="preserve">Central AI Team:</w:t>
+      </w:r>
+      <w:r>
+        <w:t xml:space="preserve"> write the Jack Link's metrics skill (KPI definitions, fiscal calendar) and provision it org-wide.</w:t>
+      </w:r>
+    </w:p>
+    <w:p>
+      <w:pPr>
         <w:pStyle w:val="Heading2"/>
       </w:pPr>
       <w:r>
@@ -2465,7 +3005,7 @@
         <w:pStyle w:val="ListParagraph"/>
         <w:numPr>
           <w:ilvl w:val="0"/>
-          <w:numId w:val="11"/>
+          <w:numId w:val="15"/>
         </w:numPr>
       </w:pPr>
       <w:hyperlink r:id="rId5" w:history="1">
@@ -2482,7 +3022,7 @@
         <w:pStyle w:val="ListParagraph"/>
         <w:numPr>
           <w:ilvl w:val="0"/>
-          <w:numId w:val="11"/>
+          <w:numId w:val="15"/>
         </w:numPr>
       </w:pPr>
       <w:hyperlink r:id="rId4" w:history="1">
@@ -2499,7 +3039,7 @@
         <w:pStyle w:val="ListParagraph"/>
         <w:numPr>
           <w:ilvl w:val="0"/>
-          <w:numId w:val="11"/>
+          <w:numId w:val="15"/>
         </w:numPr>
       </w:pPr>
       <w:hyperlink r:id="rId3" w:history="1">
@@ -2516,7 +3056,7 @@
         <w:pStyle w:val="ListParagraph"/>
         <w:numPr>
           <w:ilvl w:val="0"/>
-          <w:numId w:val="11"/>
+          <w:numId w:val="15"/>
         </w:numPr>
       </w:pPr>
       <w:hyperlink r:id="rId8" w:history="1">
@@ -2533,7 +3073,7 @@
         <w:pStyle w:val="ListParagraph"/>
         <w:numPr>
           <w:ilvl w:val="0"/>
-          <w:numId w:val="11"/>
+          <w:numId w:val="15"/>
         </w:numPr>
       </w:pPr>
       <w:hyperlink r:id="rId7" w:history="1">
@@ -2550,7 +3090,7 @@
         <w:pStyle w:val="ListParagraph"/>
         <w:numPr>
           <w:ilvl w:val="0"/>
-          <w:numId w:val="11"/>
+          <w:numId w:val="15"/>
         </w:numPr>
       </w:pPr>
       <w:hyperlink r:id="rId6" w:history="1">
@@ -2559,6 +3099,108 @@
             <w:rStyle w:val="Hyperlink"/>
           </w:rPr>
           <w:t xml:space="preserve">Claude Enterprise pricing estimates (tl;dv, third party)</w:t>
+        </w:r>
+      </w:hyperlink>
+    </w:p>
+    <w:p>
+      <w:pPr>
+        <w:pStyle w:val="ListParagraph"/>
+        <w:numPr>
+          <w:ilvl w:val="0"/>
+          <w:numId w:val="16"/>
+        </w:numPr>
+      </w:pPr>
+      <w:hyperlink r:id="rId11" w:history="1">
+        <w:r>
+          <w:rPr>
+            <w:rStyle w:val="Hyperlink"/>
+          </w:rPr>
+          <w:t xml:space="preserve">Fabric IQ MCP server (Microsoft Learn)</w:t>
+        </w:r>
+      </w:hyperlink>
+    </w:p>
+    <w:p>
+      <w:pPr>
+        <w:pStyle w:val="ListParagraph"/>
+        <w:numPr>
+          <w:ilvl w:val="0"/>
+          <w:numId w:val="16"/>
+        </w:numPr>
+      </w:pPr>
+      <w:hyperlink r:id="rId15" w:history="1">
+        <w:r>
+          <w:rPr>
+            <w:rStyle w:val="Hyperlink"/>
+          </w:rPr>
+          <w:t xml:space="preserve">Power BI MCP servers overview (Microsoft Learn)</w:t>
+        </w:r>
+      </w:hyperlink>
+    </w:p>
+    <w:p>
+      <w:pPr>
+        <w:pStyle w:val="ListParagraph"/>
+        <w:numPr>
+          <w:ilvl w:val="0"/>
+          <w:numId w:val="16"/>
+        </w:numPr>
+      </w:pPr>
+      <w:hyperlink r:id="rId16" w:history="1">
+        <w:r>
+          <w:rPr>
+            <w:rStyle w:val="Hyperlink"/>
+          </w:rPr>
+          <w:t xml:space="preserve">Fabric data agent as MCP server (Microsoft Learn)</w:t>
+        </w:r>
+      </w:hyperlink>
+    </w:p>
+    <w:p>
+      <w:pPr>
+        <w:pStyle w:val="ListParagraph"/>
+        <w:numPr>
+          <w:ilvl w:val="0"/>
+          <w:numId w:val="16"/>
+        </w:numPr>
+      </w:pPr>
+      <w:hyperlink r:id="rId18" w:history="1">
+        <w:r>
+          <w:rPr>
+            <w:rStyle w:val="Hyperlink"/>
+          </w:rPr>
+          <w:t xml:space="preserve">Custom connectors using remote MCP (Claude Help Center)</w:t>
+        </w:r>
+      </w:hyperlink>
+    </w:p>
+    <w:p>
+      <w:pPr>
+        <w:pStyle w:val="ListParagraph"/>
+        <w:numPr>
+          <w:ilvl w:val="0"/>
+          <w:numId w:val="16"/>
+        </w:numPr>
+      </w:pPr>
+      <w:hyperlink r:id="rId13" w:history="1">
+        <w:r>
+          <w:rPr>
+            <w:rStyle w:val="Hyperlink"/>
+          </w:rPr>
+          <w:t xml:space="preserve">Provision skills for your organization (Claude Help Center)</w:t>
+        </w:r>
+      </w:hyperlink>
+    </w:p>
+    <w:p>
+      <w:pPr>
+        <w:pStyle w:val="ListParagraph"/>
+        <w:numPr>
+          <w:ilvl w:val="0"/>
+          <w:numId w:val="16"/>
+        </w:numPr>
+      </w:pPr>
+      <w:hyperlink r:id="rId14" w:history="1">
+        <w:r>
+          <w:rPr>
+            <w:rStyle w:val="Hyperlink"/>
+          </w:rPr>
+          <w:t xml:space="preserve">What are artifacts (Claude Help Center)</w:t>
         </w:r>
       </w:hyperlink>
     </w:p>
@@ -2783,6 +3425,24 @@
     <w:abstractNumId w:val="0"/>
   </w:num>
   <w:num w:numId="11">
+    <w:abstractNumId w:val="0"/>
+  </w:num>
+  <w:num w:numId="12">
+    <w:abstractNumId w:val="1"/>
+    <w:lvlOverride w:ilvl="0">
+      <w:startOverride w:val="1"/>
+    </w:lvlOverride>
+  </w:num>
+  <w:num w:numId="13">
+    <w:abstractNumId w:val="0"/>
+  </w:num>
+  <w:num w:numId="14">
+    <w:abstractNumId w:val="0"/>
+  </w:num>
+  <w:num w:numId="15">
+    <w:abstractNumId w:val="0"/>
+  </w:num>
+  <w:num w:numId="16">
     <w:abstractNumId w:val="0"/>
   </w:num>
 </w:numbering>

</xml_diff>